<commit_message>
fix: align paper question markers and remove prequiz watermark
</commit_message>
<xml_diff>
--- a/templates/pre_tpl.docx
+++ b/templates/pre_tpl.docx
@@ -1043,92 +1043,6 @@
     </w:pPr>
     <w:r>
       <w:rPr>
-        <w:rFonts w:hint="eastAsia"/>
-        <w:noProof/>
-        <w:bdr w:val="single" w:sz="4" w:space="0" w:color="auto"/>
-        <w:lang w:val="zh-TW"/>
-      </w:rPr>
-      <w:drawing>
-        <wp:anchor distT="0" distB="0" distL="114300" distR="114300" simplePos="0" relativeHeight="251670528" behindDoc="1" locked="0" layoutInCell="1" allowOverlap="1" wp14:anchorId="232F8C3F" wp14:editId="4B103F49">
-          <wp:simplePos x="0" y="0"/>
-          <wp:positionH relativeFrom="column">
-            <wp:posOffset>-979069</wp:posOffset>
-          </wp:positionH>
-          <wp:positionV relativeFrom="page">
-            <wp:posOffset>-304063</wp:posOffset>
-          </wp:positionV>
-          <wp:extent cx="3342640" cy="4434205"/>
-          <wp:effectExtent l="0" t="0" r="0" b="0"/>
-          <wp:wrapNone/>
-          <wp:docPr id="17826748" name="圖片 6" descr="一張含有 文字, 圖形, 字型, 標誌 的圖片&#10;&#10;AI 產生的內容可能不正確。"/>
-          <wp:cNvGraphicFramePr>
-            <a:graphicFrameLocks xmlns:a="http://schemas.openxmlformats.org/drawingml/2006/main" noChangeAspect="1"/>
-          </wp:cNvGraphicFramePr>
-          <a:graphic xmlns:a="http://schemas.openxmlformats.org/drawingml/2006/main">
-            <a:graphicData uri="http://schemas.openxmlformats.org/drawingml/2006/picture">
-              <pic:pic xmlns:pic="http://schemas.openxmlformats.org/drawingml/2006/picture">
-                <pic:nvPicPr>
-                  <pic:cNvPr id="2081543088" name="圖片 6" descr="一張含有 文字, 圖形, 字型, 標誌 的圖片&#10;&#10;AI 產生的內容可能不正確。"/>
-                  <pic:cNvPicPr/>
-                </pic:nvPicPr>
-                <pic:blipFill rotWithShape="1">
-                  <a:blip r:embed="rId1" cstate="print">
-                    <a:alphaModFix amt="10000"/>
-                    <a:biLevel thresh="50000"/>
-                    <a:extLst>
-                      <a:ext uri="{BEBA8EAE-BF5A-486C-A8C5-ECC9F3942E4B}">
-                        <a14:imgProps xmlns:a14="http://schemas.microsoft.com/office/drawing/2010/main">
-                          <a14:imgLayer r:embed="rId2">
-                            <a14:imgEffect>
-                              <a14:saturation sat="0"/>
-                            </a14:imgEffect>
-                            <a14:imgEffect>
-                              <a14:brightnessContrast bright="-40000" contrast="-40000"/>
-                            </a14:imgEffect>
-                          </a14:imgLayer>
-                        </a14:imgProps>
-                      </a:ext>
-                      <a:ext uri="{28A0092B-C50C-407E-A947-70E740481C1C}">
-                        <a14:useLocalDpi xmlns:a14="http://schemas.microsoft.com/office/drawing/2010/main" val="0"/>
-                      </a:ext>
-                    </a:extLst>
-                  </a:blip>
-                  <a:srcRect l="18440" t="3917" r="18470" b="26357"/>
-                  <a:stretch>
-                    <a:fillRect/>
-                  </a:stretch>
-                </pic:blipFill>
-                <pic:spPr bwMode="auto">
-                  <a:xfrm>
-                    <a:off x="0" y="0"/>
-                    <a:ext cx="3342640" cy="4434205"/>
-                  </a:xfrm>
-                  <a:prstGeom prst="rect">
-                    <a:avLst/>
-                  </a:prstGeom>
-                  <a:ln>
-                    <a:noFill/>
-                  </a:ln>
-                  <a:extLst>
-                    <a:ext uri="{53640926-AAD7-44D8-BBD7-CCE9431645EC}">
-                      <a14:shadowObscured xmlns:a14="http://schemas.microsoft.com/office/drawing/2010/main"/>
-                    </a:ext>
-                  </a:extLst>
-                </pic:spPr>
-              </pic:pic>
-            </a:graphicData>
-          </a:graphic>
-          <wp14:sizeRelH relativeFrom="margin">
-            <wp14:pctWidth>0</wp14:pctWidth>
-          </wp14:sizeRelH>
-          <wp14:sizeRelV relativeFrom="margin">
-            <wp14:pctHeight>0</wp14:pctHeight>
-          </wp14:sizeRelV>
-        </wp:anchor>
-      </w:drawing>
-    </w:r>
-    <w:r>
-      <w:rPr>
         <w:sz w:val="18"/>
         <w:szCs w:val="18"/>
       </w:rPr>
@@ -1154,92 +1068,6 @@
       </w:rPr>
       <w:jc w:val="left"/>
     </w:pPr>
-    <w:r>
-      <w:rPr>
-        <w:rFonts w:hint="eastAsia"/>
-        <w:noProof/>
-        <w:bdr w:val="single" w:sz="4" w:space="0" w:color="auto"/>
-        <w:lang w:val="zh-TW"/>
-      </w:rPr>
-      <w:drawing>
-        <wp:anchor distT="0" distB="0" distL="114300" distR="114300" simplePos="0" relativeHeight="251673600" behindDoc="1" locked="0" layoutInCell="1" allowOverlap="1" wp14:anchorId="12D3A71F" wp14:editId="5CBF0828">
-          <wp:simplePos x="0" y="0"/>
-          <wp:positionH relativeFrom="column">
-            <wp:posOffset>-979069</wp:posOffset>
-          </wp:positionH>
-          <wp:positionV relativeFrom="page">
-            <wp:posOffset>-304063</wp:posOffset>
-          </wp:positionV>
-          <wp:extent cx="3342640" cy="4434205"/>
-          <wp:effectExtent l="0" t="0" r="0" b="0"/>
-          <wp:wrapNone/>
-          <wp:docPr id="1800539164" name="圖片 6" descr="一張含有 文字, 圖形, 字型, 標誌 的圖片&#10;&#10;AI 產生的內容可能不正確。"/>
-          <wp:cNvGraphicFramePr>
-            <a:graphicFrameLocks xmlns:a="http://schemas.openxmlformats.org/drawingml/2006/main" noChangeAspect="1"/>
-          </wp:cNvGraphicFramePr>
-          <a:graphic xmlns:a="http://schemas.openxmlformats.org/drawingml/2006/main">
-            <a:graphicData uri="http://schemas.openxmlformats.org/drawingml/2006/picture">
-              <pic:pic xmlns:pic="http://schemas.openxmlformats.org/drawingml/2006/picture">
-                <pic:nvPicPr>
-                  <pic:cNvPr id="2081543088" name="圖片 6" descr="一張含有 文字, 圖形, 字型, 標誌 的圖片&#10;&#10;AI 產生的內容可能不正確。"/>
-                  <pic:cNvPicPr/>
-                </pic:nvPicPr>
-                <pic:blipFill rotWithShape="1">
-                  <a:blip r:embed="rId1" cstate="print">
-                    <a:alphaModFix amt="10000"/>
-                    <a:biLevel thresh="50000"/>
-                    <a:extLst>
-                      <a:ext uri="{BEBA8EAE-BF5A-486C-A8C5-ECC9F3942E4B}">
-                        <a14:imgProps xmlns:a14="http://schemas.microsoft.com/office/drawing/2010/main">
-                          <a14:imgLayer r:embed="rId2">
-                            <a14:imgEffect>
-                              <a14:saturation sat="0"/>
-                            </a14:imgEffect>
-                            <a14:imgEffect>
-                              <a14:brightnessContrast bright="-40000" contrast="-40000"/>
-                            </a14:imgEffect>
-                          </a14:imgLayer>
-                        </a14:imgProps>
-                      </a:ext>
-                      <a:ext uri="{28A0092B-C50C-407E-A947-70E740481C1C}">
-                        <a14:useLocalDpi xmlns:a14="http://schemas.microsoft.com/office/drawing/2010/main" val="0"/>
-                      </a:ext>
-                    </a:extLst>
-                  </a:blip>
-                  <a:srcRect l="18440" t="3917" r="18470" b="26357"/>
-                  <a:stretch>
-                    <a:fillRect/>
-                  </a:stretch>
-                </pic:blipFill>
-                <pic:spPr bwMode="auto">
-                  <a:xfrm>
-                    <a:off x="0" y="0"/>
-                    <a:ext cx="3342640" cy="4434205"/>
-                  </a:xfrm>
-                  <a:prstGeom prst="rect">
-                    <a:avLst/>
-                  </a:prstGeom>
-                  <a:ln>
-                    <a:noFill/>
-                  </a:ln>
-                  <a:extLst>
-                    <a:ext uri="{53640926-AAD7-44D8-BBD7-CCE9431645EC}">
-                      <a14:shadowObscured xmlns:a14="http://schemas.microsoft.com/office/drawing/2010/main"/>
-                    </a:ext>
-                  </a:extLst>
-                </pic:spPr>
-              </pic:pic>
-            </a:graphicData>
-          </a:graphic>
-          <wp14:sizeRelH relativeFrom="margin">
-            <wp14:pctWidth>0</wp14:pctWidth>
-          </wp14:sizeRelH>
-          <wp14:sizeRelV relativeFrom="margin">
-            <wp14:pctHeight>0</wp14:pctHeight>
-          </wp14:sizeRelV>
-        </wp:anchor>
-      </w:drawing>
-    </w:r>
     <w:r>
       <w:rPr>
         <w:sz w:val="18"/>

</xml_diff>

<commit_message>
fix: prequiz logo ratio, editable toolbar metadata and full-width passages
</commit_message>
<xml_diff>
--- a/templates/pre_tpl.docx
+++ b/templates/pre_tpl.docx
@@ -593,7 +593,7 @@
       <w:r>
         <w:drawing>
           <wp:inline distT="0" distB="0" distL="0" distR="0">
-            <wp:extent cx="3967200" cy="2059200"/>
+            <wp:extent cx="8337550" cy="2059200"/>
             <wp:docPr id="9000001" name="Group Passage"/>
             <wp:cNvGraphicFramePr/>
             <ns0:graphic xmlns:ns0="http://schemas.openxmlformats.org/drawingml/2006/main">
@@ -603,7 +603,7 @@
                   <wps:spPr>
                     <ns0:xfrm>
                       <ns0:off x="0" y="0"/>
-                      <ns0:ext cx="3967200" cy="2059200"/>
+                      <ns0:ext cx="8337550" cy="2059200"/>
                     </ns0:xfrm>
                     <ns0:prstGeom prst="rect">
                       <ns0:avLst/>

</xml_diff>